<commit_message>
Plan the roadmap from the launch date, not from the ТЗ estimates
Заказчик уточнил: сроки в ТЗ ориентировочные, ориентир — 01.01.2027.
Раздел о сроках переписан: план строится от даты запуска назад, а
разница с оценкой ТЗ больше не подаётся как ограничение.

Этап 4 «Развитие» описан как порядок ввода, а не урезание объёма:
уведомления, расширенная отчётность и готовые подборки не мешают
продавать и выполняются на уже работающем портале.

Даты этапов не изменились — календарь и так сходился к 31.12 точно.
В рисках вместо «сжатого срока» указано отсутствие свободного запаса и
чем компенсируется смещение: отказом от требований Should, а не сдвигом
даты запуска.
</commit_message>
<xml_diff>
--- a/Дорожная_карта_forus_by.docx
+++ b/Дорожная_карта_forus_by.docx
@@ -20,17 +20,27 @@
         <w:pStyle w:val="Heading2"/>
       </w:pPr>
       <w:r>
-        <w:t xml:space="preserve">1. Сроки и главное ограничение</w:t>
+        <w:t xml:space="preserve">1. Сроки</w:t>
       </w:r>
     </w:p>
     <w:p>
       <w:r>
-        <w:t xml:space="preserve">Техническое задание оценивает разработку в 20 недель (этапы 0–4). От 01.09.2026 до 01.01.2027 — 17,5 недель. Поэтому в срок укладываются этапы 0–3, дающие полный цикл сделки онлайн, а этап 4 «Развитие» переносится на I квартал 2027 года.</w:t>
+        <w:t xml:space="preserve">Дата запуска зафиксирована — 01.01.2027. Оценки длительности этапов в техническом задании ориентировочные, поэтому план построен от даты запуска назад, а не от них.</w:t>
       </w:r>
     </w:p>
     <w:p>
       <w:r>
-        <w:t xml:space="preserve">Второе ограничение важнее календарного. Значительная часть работ — не программирование, а подготовка данных силами сотрудников ФОРУС: выверка адресной программы, фотосъёмка, ввод показателей охвата, перенос занятости из Excel. Эти работы лежат на критическом пути и идут параллельно с разработкой, а не после неё. Витрина без достоверной занятости бесполезна, а собрать данные за неделю до запуска невозможно.</w:t>
+        <w:t xml:space="preserve">В эксплуатацию 01.01.2027 выводятся этапы 0–3: они дают полный цикл сделки онлайн — от выбора площадки до оплаты, расчёта сбора и документов. Этап 4 «Развитие» выполняется после запуска, на уже работающем портале: уведомления во всех каналах, расширенная отчётность, готовые подборки. Это не урезание объёма, а порядок ввода: перечисленное в этапе 4 не мешает продавать.</w:t>
+      </w:r>
+    </w:p>
+    <w:p>
+      <w:r>
+        <w:t xml:space="preserve">Календарь ниже сходится к дате точно: 16 недель работ и полторы недели на финальную приёмку. Свободного запаса в нём нет, поэтому смещение компенсируется отказом от требований приоритета Should, а не сдвигом даты запуска.</w:t>
+      </w:r>
+    </w:p>
+    <w:p>
+      <w:r>
+        <w:t xml:space="preserve">Главное ограничение плана — не календарь, а данные. Значительная часть работ приходится не на программирование, а на подготовку данных силами сотрудников ФОРУС: выверка адресной программы, фотосъёмка, ввод показателей охвата, перенос занятости из Excel. Эти работы лежат на критическом пути и идут параллельно с разработкой, а не после неё. Витрина без достоверной занятости бесполезна, а собрать данные за неделю до запуска невозможно.</w:t>
       </w:r>
     </w:p>
     <w:tbl>
@@ -328,7 +338,7 @@
               <w:spacing w:before="40" w:after="40"/>
             </w:pPr>
             <w:r>
-              <w:t xml:space="preserve">январь – февраль 2027</w:t>
+              <w:t xml:space="preserve">после запуска, I квартал 2027</w:t>
             </w:r>
           </w:p>
         </w:tc>
@@ -350,7 +360,7 @@
     <w:p/>
     <w:p>
       <w:r>
-        <w:t xml:space="preserve">Приёмка этапов 0–2 идёт параллельно со следующим этапом. Отдельное время в конце декабря выделено только на финальную приёмку. Если проводить приёмку каждого этапа последовательно, по 10 рабочих дней, срок 01.01.2027 недостижим.</w:t>
+        <w:t xml:space="preserve">Приёмка этапов 0–2 идёт параллельно со следующим этапом. Отдельное время в конце декабря выделено только на финальную приёмку. Если проводить приёмку каждого этапа последовательно, по 10 рабочих дней, дата запуска не выдерживается.</w:t>
       </w:r>
     </w:p>
     <w:p>
@@ -4623,7 +4633,7 @@
               <w:spacing w:before="40" w:after="40"/>
             </w:pPr>
             <w:r>
-              <w:t xml:space="preserve">Сжатый срок: 16 недель работ из 17,5 доступных</w:t>
+              <w:t xml:space="preserve">В календаре нет свободного запаса: 16 недель работ и полторы на приёмку</w:t>
             </w:r>
           </w:p>
         </w:tc>
@@ -4649,7 +4659,7 @@
               <w:spacing w:before="40" w:after="40"/>
             </w:pPr>
             <w:r>
-              <w:t xml:space="preserve">Параллельная приёмка этапов, перенос этапа 4 на 2027 год, отказ от требований приоритета Should до запуска</w:t>
+              <w:t xml:space="preserve">Приёмка этапов идёт параллельно со следующим этапом. Смещение компенсируется отказом от требований приоритета Should, а не сдвигом даты запуска. Этап 4 изначально вынесен за дату</w:t>
             </w:r>
           </w:p>
         </w:tc>

</xml_diff>